<commit_message>
feat(auth): implement comprehensive account and pet management
- Add account deletion and restoration logic to admin and auth panels
- Enable pet profile management within booking workflows
- Expand UI state for managing user, doctor, and deleted accounts
- Integrate persistent pet profile selection in appointments
</commit_message>
<xml_diff>
--- a/public/Doklad_Zashchita_Lapa_Pomoshchi_Krivosheev_KD.docx
+++ b/public/Doklad_Zashchita_Lapa_Pomoshchi_Krivosheev_KD.docx
@@ -147,7 +147,7 @@
           <w:sz w:val="28"/>
           <w:szCs w:val="28"/>
         </w:rPr>
-        <w:t xml:space="preserve">5–6 минут (9 слайдов + показ сайта)</w:t>
+        <w:t xml:space="preserve">5–6 минут (9 слайдов + показ сайта по вкладкам)</w:t>
       </w:r>
     </w:p>
     <w:p>
@@ -664,7 +664,7 @@
           <w:sz w:val="24"/>
           <w:szCs w:val="24"/>
         </w:rPr>
-        <w:t xml:space="preserve">(4:00 – 5:30)</w:t>
+        <w:t xml:space="preserve">(4:00 – 5:40)</w:t>
       </w:r>
     </w:p>
     <w:p>
@@ -710,7 +710,7 @@
           <w:sz w:val="28"/>
           <w:szCs w:val="28"/>
         </w:rPr>
-        <w:t xml:space="preserve">«Перейдём к демонстрации разработанного веб-сайта. На главной странице представлены форма экспресс-обращения, каталог ветеринарных услуг с фильтрацией и поиском, а также интерактивный калькулятор комплексного чек-апа, который сразу пересчитывает стоимость с учётом вида животного и выбранного врача. При нажатии кнопки "Записаться" открывается окно выбора специалиста, даты и свободных часов приёма — занятые окна автоматически заблокированы. После записи формируется именной талон с памяткой подготовки. В личном кабинете клиента доступна электронная медкарта питомца, перенос визита и просмотр выписок врача. В личном кабинете врача специалист видит своих пациентов, пишет рекомендации и проверяет закрытый внутренний график дежурств бригад 2 через 2, который автоматически учитывает больничные листы, отпуска и назначает врача на замену. В панели администратора доступны сводка выручки, управление всеми заявками, редактирование прайс-листа и штата специалистов.»</w:t>
+        <w:t xml:space="preserve">«Перейдём к демонстрации разработанного веб-сайта. Чтобы не перегружать интерфейс на одной длинной странице, навигация в шапке сайта разделена на отдельные функциональные вкладки: "Главная и услуги", "Врачи (8)" и "Отзывы". На главной вкладке представлены форма экспресс-обращения, каталог ветеринарных услуг с фильтрацией по категориям и интерактивный калькулятор чек-апа, который сразу пересчитывает стоимость с учётом вида животного и выбранного врача. При переходе на отдельную вкладку "Врачи" открывается полный штат из восьми профильных специалистов с поиском по ФИО, фильтрацией по направлениям, подробным резюме и прямой кнопкой записи к конкретному доктору. На отдельной вкладке "Отзывы" собраны реальные истории лечения пациентов с фильтрацией по видам животных — кошки, собаки, грызуны и птицы, а также форма публикации нового отзыва. При нажатии кнопки "Записаться" открывается окно выбора специалиста, даты и свободных часов приёма — занятые окна автоматически заблокированы. В личном кабинете клиента доступна электронная медкарта питомца, перенос визита, а также возможность самостоятельно удалить свой аккаунт с модальным предупреждением. В личном кабинете врача специалист видит своих пациентов, пишет выписки и проверяет закрытый внутренний график дежурств бригад 2 через 2 с автоматическим учётом больничных и подмен, при этом врачам по правилам безопасности запрещено удалять свою служебную учётную запись. В панели администратора доступны сводка выручки, управление всеми заявками, прайс-листом, а также вкладка управления аккаунтами, где администратор может удалить любой аккаунт клиента или врача с обязательным предупреждением.»</w:t>
       </w:r>
     </w:p>
     <w:p>
@@ -742,7 +742,7 @@
           <w:sz w:val="24"/>
           <w:szCs w:val="24"/>
         </w:rPr>
-        <w:t xml:space="preserve">(5:30 – 6:00)</w:t>
+        <w:t xml:space="preserve">(5:40 – 6:10)</w:t>
       </w:r>
     </w:p>
     <w:p>
@@ -788,7 +788,7 @@
           <w:sz w:val="28"/>
           <w:szCs w:val="28"/>
         </w:rPr>
-        <w:t xml:space="preserve">«Подводя итог: цель курсового проекта полностью достигнута. Разработан адаптивный веб-сайт ветеринарной клиники с онлайн-записью к восьми профильным врачам 24/7, реализованы три ролевых интерфейса (клиент, врач, администратор), настроена защита от двойных записей и проведено автоматическое тестирование из 16 модульных тестов. В перспективе развития проекта предусмотрено подключение онлайн-оплаты, Telegram-уведомлений и мобильного приложения.»</w:t>
+        <w:t xml:space="preserve">«Подводя итог: цель курсового проекта полностью достигнута. Разработан адаптивный многовкладочный веб-сайт ветеринарной клиники с онлайн-записью к восьми профильным врачам 24/7, выделенными разделами штата врачей и отзывов клиентов, реализованы три ролевых интерфейса (клиент, врач, администратор) с разграничением прав на управление и удаление аккаунтов, настроена защита от двойных записей и проведено автоматическое тестирование из 16 модульных тестов. В перспективе развития проекта предусмотрено подключение онлайн-оплаты, Telegram-уведомлений и мобильного приложения.»</w:t>
       </w:r>
     </w:p>
     <w:p>
@@ -820,7 +820,7 @@
           <w:sz w:val="24"/>
           <w:szCs w:val="24"/>
         </w:rPr>
-        <w:t xml:space="preserve">(6:00 – 6:15)</w:t>
+        <w:t xml:space="preserve">(6:10 – 6:25)</w:t>
       </w:r>
     </w:p>
     <w:p>
@@ -884,7 +884,7 @@
           <w:szCs w:val="28"/>
           <w:u w:val="single"/>
         </w:rPr>
-        <w:t xml:space="preserve">2. ПАМЯТКА ДЛЯ ЖИВОГО ПОКАЗА САЙТА НА 7-М СЛАЙДЕ (ЧЕК-ЛИСТ)</w:t>
+        <w:t xml:space="preserve">2. ПАМЯТКА ДЛЯ ЖИВОГО ПОКАЗА САЙТА НА 7-М СЛАЙДЕ (ЧЕК-ЛИСТ ПО ВКЛАДКАМ)</w:t>
       </w:r>
     </w:p>
     <w:p>
@@ -899,7 +899,7 @@
           <w:sz w:val="28"/>
           <w:szCs w:val="28"/>
         </w:rPr>
-        <w:t xml:space="preserve">Когда на 7-м слайде вы переключаетесь в браузер для демонстрации сайта, покажите комиссии следующие 5 элементов по порядку:</w:t>
+        <w:t xml:space="preserve">Когда на 7-м слайде вы переключаетесь в браузер для демонстрации сайта, покажите комиссии следующие 6 элементов по порядку:</w:t>
       </w:r>
     </w:p>
     <w:p>
@@ -916,15 +916,15 @@
           <w:sz w:val="28"/>
           <w:szCs w:val="28"/>
         </w:rPr>
-        <w:t xml:space="preserve">Шаг 1. Главная страница и каталог услуг: </w:t>
-      </w:r>
-      <w:r>
-        <w:rPr>
-          <w:rFonts w:ascii="Times New Roman" w:cs="Times New Roman" w:eastAsia="Times New Roman" w:hAnsi="Times New Roman"/>
-          <w:sz w:val="28"/>
-          <w:szCs w:val="28"/>
-        </w:rPr>
-        <w:t xml:space="preserve">прокрутите страницу вниз, нажмите фильтр категорий («Диагностика», «Лечение») и покажите, что за каждой услугой закреплён ведущий профильный врач.</w:t>
+        <w:t xml:space="preserve">Шаг 1. Вкладка «Главная и услуги» + калькулятор чек-апа: </w:t>
+      </w:r>
+      <w:r>
+        <w:rPr>
+          <w:rFonts w:ascii="Times New Roman" w:cs="Times New Roman" w:eastAsia="Times New Roman" w:hAnsi="Times New Roman"/>
+          <w:sz w:val="28"/>
+          <w:szCs w:val="28"/>
+        </w:rPr>
+        <w:t xml:space="preserve">покажите главный экран, фильтр категорий услуг («Диагностика», «Лечение») и интерактивный калькулятор чек-апа, где при выборе вида животного и опции «Экспресс-лаборатория CITO» мгновенно пересчитывается итоговая цена.</w:t>
       </w:r>
     </w:p>
     <w:p>
@@ -941,15 +941,15 @@
           <w:sz w:val="28"/>
           <w:szCs w:val="28"/>
         </w:rPr>
-        <w:t xml:space="preserve">Шаг 2. Интерактивный калькулятор чек-апа: </w:t>
-      </w:r>
-      <w:r>
-        <w:rPr>
-          <w:rFonts w:ascii="Times New Roman" w:cs="Times New Roman" w:eastAsia="Times New Roman" w:hAnsi="Times New Roman"/>
-          <w:sz w:val="28"/>
-          <w:szCs w:val="28"/>
-        </w:rPr>
-        <w:t xml:space="preserve">выберите «Собака» или «Кошка», переключите программу обследования и отметьте галочку «Экспресс-лаборатория CITO» — покажите, как мгновенно пересчитывается итоговая цена.</w:t>
+        <w:t xml:space="preserve">Шаг 2. Отдельная вкладка «Врачи (8)»: </w:t>
+      </w:r>
+      <w:r>
+        <w:rPr>
+          <w:rFonts w:ascii="Times New Roman" w:cs="Times New Roman" w:eastAsia="Times New Roman" w:hAnsi="Times New Roman"/>
+          <w:sz w:val="28"/>
+          <w:szCs w:val="28"/>
+        </w:rPr>
+        <w:t xml:space="preserve">переключитесь в верхней панели навигации на вкладку «Врачи (8)». Покажите, что штат специалистов вынесен на отдельную страницу: нажмите фильтр по специализации (например, «Хирургия» или «Терапия»), откройте модальное окно «Подробнее о враче» и кнопку «Записаться к врачу».</w:t>
       </w:r>
     </w:p>
     <w:p>
@@ -966,15 +966,15 @@
           <w:sz w:val="28"/>
           <w:szCs w:val="28"/>
         </w:rPr>
-        <w:t xml:space="preserve">Шаг 3. Форма онлайн-записи и проверка свободных слотов: </w:t>
-      </w:r>
-      <w:r>
-        <w:rPr>
-          <w:rFonts w:ascii="Times New Roman" w:cs="Times New Roman" w:eastAsia="Times New Roman" w:hAnsi="Times New Roman"/>
-          <w:sz w:val="28"/>
-          <w:szCs w:val="28"/>
-        </w:rPr>
-        <w:t xml:space="preserve">нажмите «Записаться на прием», выберите врача и дату — покажите, что занятые часы заблокированы (серые), а свободные окна активны.</w:t>
+        <w:t xml:space="preserve">Шаг 3. Отдельная вкладка «Отзывы»: </w:t>
+      </w:r>
+      <w:r>
+        <w:rPr>
+          <w:rFonts w:ascii="Times New Roman" w:cs="Times New Roman" w:eastAsia="Times New Roman" w:hAnsi="Times New Roman"/>
+          <w:sz w:val="28"/>
+          <w:szCs w:val="28"/>
+        </w:rPr>
+        <w:t xml:space="preserve">переключитесь в шапке на вкладку «Отзывы». Покажите сводный рейтинг 4.9 из 5, фильтр историй выздоровления по видам животных («Кошки», «Собаки», «Грызуны», «Птицы») и кнопку «Оставить отзыв».</w:t>
       </w:r>
     </w:p>
     <w:p>
@@ -991,15 +991,15 @@
           <w:sz w:val="28"/>
           <w:szCs w:val="28"/>
         </w:rPr>
-        <w:t xml:space="preserve">Шаг 4. Личный кабинет врача и закрытый график 2/2: </w:t>
-      </w:r>
-      <w:r>
-        <w:rPr>
-          <w:rFonts w:ascii="Times New Roman" w:cs="Times New Roman" w:eastAsia="Times New Roman" w:hAnsi="Times New Roman"/>
-          <w:sz w:val="28"/>
-          <w:szCs w:val="28"/>
-        </w:rPr>
-        <w:t xml:space="preserve">нажмите «Войти» и выберите демо-вход врача (например, Главврач Смирнов А.В.). Откройте «Кабинет врача» и перейдите на вкладку «График дежурств 2/2» — обратите внимание комиссии, что график смен 2/2 скрыт от обычных посетителей сайта и доступен только персоналу, при этом система сама назначает замену, если врач на больничном или в отпуске.</w:t>
+        <w:t xml:space="preserve">Шаг 4. Форма онлайн-записи и кабинет клиента (удаление своего аккаунта): </w:t>
+      </w:r>
+      <w:r>
+        <w:rPr>
+          <w:rFonts w:ascii="Times New Roman" w:cs="Times New Roman" w:eastAsia="Times New Roman" w:hAnsi="Times New Roman"/>
+          <w:sz w:val="28"/>
+          <w:szCs w:val="28"/>
+        </w:rPr>
+        <w:t xml:space="preserve">нажмите «Записаться на прием», покажите блокировку занятых часов. Затем откройте «Мои записи» под клиентом — покажите медкарту питомца и кнопку «Удалить мой аккаунт» с окном предупреждения.</w:t>
       </w:r>
     </w:p>
     <w:p>
@@ -1016,15 +1016,40 @@
           <w:sz w:val="28"/>
           <w:szCs w:val="28"/>
         </w:rPr>
-        <w:t xml:space="preserve">Шаг 5. Панель администратора (CRM): </w:t>
-      </w:r>
-      <w:r>
-        <w:rPr>
-          <w:rFonts w:ascii="Times New Roman" w:cs="Times New Roman" w:eastAsia="Times New Roman" w:hAnsi="Times New Roman"/>
-          <w:sz w:val="28"/>
-          <w:szCs w:val="28"/>
-        </w:rPr>
-        <w:t xml:space="preserve">переключитесь на аккаунт Администратора (логин «1», пароль «1»). Покажите сводку выручки, список всех записей клиники и возможность редактировать цены услуг с автоматической синхронизацией.</w:t>
+        <w:t xml:space="preserve">Шаг 5. Личный кабинет врача (запрет удаления аккаунта + закрытый график 2/2): </w:t>
+      </w:r>
+      <w:r>
+        <w:rPr>
+          <w:rFonts w:ascii="Times New Roman" w:cs="Times New Roman" w:eastAsia="Times New Roman" w:hAnsi="Times New Roman"/>
+          <w:sz w:val="28"/>
+          <w:szCs w:val="28"/>
+        </w:rPr>
+        <w:t xml:space="preserve">переключитесь на демо-вход врача (например, Смирнов А.В.). В «Кабинете врача» покажите кнопку с замком «Удаление своего аккаунта запрещено» (выводит предупреждение безопасности) и внутренний график дежурств 2/2 с учётом больничных и подмен.</w:t>
+      </w:r>
+    </w:p>
+    <w:p>
+      <w:pPr>
+        <w:spacing w:after="80" w:before="0" w:line="360" w:lineRule="auto"/>
+        <w:ind w:firstLine="709"/>
+        <w:jc w:val="both"/>
+      </w:pPr>
+      <w:r>
+        <w:rPr>
+          <w:rFonts w:ascii="Times New Roman" w:cs="Times New Roman" w:eastAsia="Times New Roman" w:hAnsi="Times New Roman"/>
+          <w:b/>
+          <w:bCs/>
+          <w:sz w:val="28"/>
+          <w:szCs w:val="28"/>
+        </w:rPr>
+        <w:t xml:space="preserve">Шаг 6. Панель администратора (CRM + управление всеми аккаунтами): </w:t>
+      </w:r>
+      <w:r>
+        <w:rPr>
+          <w:rFonts w:ascii="Times New Roman" w:cs="Times New Roman" w:eastAsia="Times New Roman" w:hAnsi="Times New Roman"/>
+          <w:sz w:val="28"/>
+          <w:szCs w:val="28"/>
+        </w:rPr>
+        <w:t xml:space="preserve">переключитесь на аккаунт Администратора (логин «1», пароль «1»). Покажите сводку выручки, вкладку «Аккаунты», где администратор может удалить любой аккаунт клиента или врача с обязательным предупреждением, а также восстановить демо-аккаунты.</w:t>
       </w:r>
     </w:p>
     <w:p>
@@ -1058,7 +1083,7 @@
           <w:sz w:val="28"/>
           <w:szCs w:val="28"/>
         </w:rPr>
-        <w:t xml:space="preserve">Вопрос 1: Как в вашем проекте решена проблема «двойной записи» к одному врачу на одно и то же время?</w:t>
+        <w:t xml:space="preserve">Вопрос 1: Почему разделы «Врачи» и «Отзывы» вынесены в отдельные вкладки, а не размещены на одной длинной странице?</w:t>
       </w:r>
     </w:p>
     <w:p>
@@ -1073,7 +1098,7 @@
           <w:sz w:val="28"/>
           <w:szCs w:val="28"/>
         </w:rPr>
-        <w:t xml:space="preserve">Ответ: При выборе специалиста и даты система проверяет все активные записи в базе данных по ФИО врача и выбранному дню. Если временной слот (например, 13:00) уже занят другим клиентом, кнопка этого времени автоматически блокируется в интерфейсе, а при отправке формы выполняется повторная проверка свободности слота.</w:t>
+        <w:t xml:space="preserve">Ответ: Разделение на три вкладки («Главная и услуги», «Врачи (8)», «Отзывы») выполнено для улучшения пользовательского опыта (UX) и ускорения навигации. На главной вкладке клиент сразу видит услуги, цены и калькулятор чек-апа без лишней прокрутки, на вкладке «Врачи» может удобно отфильтровать 8 специалистов по профилю и изучить их квалификацию, а на вкладке «Отзывы» — отсортировать реальные истории лечения по виду своего питомца.</w:t>
       </w:r>
     </w:p>
     <w:p>
@@ -1090,7 +1115,7 @@
           <w:sz w:val="28"/>
           <w:szCs w:val="28"/>
         </w:rPr>
-        <w:t xml:space="preserve">Вопрос 2: Что происходит с записью, если врач заболел, ушёл в отпуск или уехал на конференцию?</w:t>
+        <w:t xml:space="preserve">Вопрос 2: Как в вашей системе разграничены права на удаление учётных записей между клиентами, врачами и администратором?</w:t>
       </w:r>
     </w:p>
     <w:p>
@@ -1105,7 +1130,7 @@
           <w:sz w:val="28"/>
           <w:szCs w:val="28"/>
         </w:rPr>
-        <w:t xml:space="preserve">Ответ: В модуле расписания реализован журнал отсутствий и автоматических подмен. Если у врача оформлен больничный лист или отпуск, система автоматически выводит в дежурство заменяющего специалиста из резервной бригады и перенаправляет запись к нему, сохраняя непрерывность приёма.</w:t>
+        <w:t xml:space="preserve">Ответ: В проекте действует строгое ролевое правило: 1) Обычные пользователи (клиенты) могут самостоятельно удалить только свой собственный аккаунт после подтверждения в диалоговом окне с предупреждением. 2) Врачам запрещено самостоятельно удалять свой служебный аккаунт (выводится предупреждение безопасности), так как к врачу привязаны график дежурств 2/2 и истории болезни пациентов. 3) Главный администратор CRM имеет полные права и может удалить любой аккаунт клиента или врача с обязательным предупреждением.</w:t>
       </w:r>
     </w:p>
     <w:p>
@@ -1122,7 +1147,7 @@
           <w:sz w:val="28"/>
           <w:szCs w:val="28"/>
         </w:rPr>
-        <w:t xml:space="preserve">Вопрос 3: Почему таблица графика смен врачей (2 через 2) не видна обычным посетителям на главной странице?</w:t>
+        <w:t xml:space="preserve">Вопрос 3: Как в вашем проекте решена проблема «двойной записи» к одному врачу на одно и то же время?</w:t>
       </w:r>
     </w:p>
     <w:p>
@@ -1137,7 +1162,7 @@
           <w:sz w:val="28"/>
           <w:szCs w:val="28"/>
         </w:rPr>
-        <w:t xml:space="preserve">Ответ: Это сделано намеренно по правилам разделения доступа: внутреннее расписание бригад, больничные листы и отпуска сотрудников являются служебной информацией клиники и доступны только в личном кабинете врача и в панели администратора. Клиент же при записи видит уже готовые доступные часы приёма выбранного специалиста.</w:t>
+        <w:t xml:space="preserve">Ответ: При выборе специалиста и даты система проверяет все активные записи в базе данных по ФИО врача и выбранному дню. Если временной слот (например, 13:00) уже занят другим клиентом, кнопка этого времени автоматически блокируется в интерфейсе, а при отправке формы выполняется повторная проверка свободности слота.</w:t>
       </w:r>
     </w:p>
     <w:p>
@@ -1154,7 +1179,7 @@
           <w:sz w:val="28"/>
           <w:szCs w:val="28"/>
         </w:rPr>
-        <w:t xml:space="preserve">Вопрос 4: Какие роли пользователей есть в системе и чем отличаются их возможности?</w:t>
+        <w:t xml:space="preserve">Вопрос 4: Что происходит с записью, если врач заболел, ушёл в отпуск или уехал на конференцию?</w:t>
       </w:r>
     </w:p>
     <w:p>
@@ -1169,7 +1194,7 @@
           <w:sz w:val="28"/>
           <w:szCs w:val="28"/>
         </w:rPr>
-        <w:t xml:space="preserve">Ответ: Реализованы три роли. 1) Клиент (владелец питомца) — записывается на приём, ведёт электронную медкарту животного, скачивает талон, переносит или отменяет свои визиты и читает выписки врача. 2) Ветеринарный врач — видит список своих пациентов, берёт в работу обращения к дежурному врачу, пишет клинические рекомендации и смотрит график смен. 3) Администратор — управляет всеми записями клиники, редактирует каталог услуг и цены, управляет штатом врачей и графиком дежурств 2/2.</w:t>
+        <w:t xml:space="preserve">Ответ: В модуле расписания реализован журнал отсутствий и автоматических подмен. Если у врача оформлен больничный лист или отпуск, система автоматически выводит в дежурство заменяющего специалиста из резервной бригады и перенаправляет запись к нему, сохраняя непрерывность приёма.</w:t>
       </w:r>
     </w:p>
     <w:p>
@@ -1186,7 +1211,39 @@
           <w:sz w:val="28"/>
           <w:szCs w:val="28"/>
         </w:rPr>
-        <w:t xml:space="preserve">Вопрос 5: Как проверялась работоспособность сайта?</w:t>
+        <w:t xml:space="preserve">Вопрос 5: Почему таблица графика смен врачей (2 через 2) не видна обычным посетителям на клиентских вкладках?</w:t>
+      </w:r>
+    </w:p>
+    <w:p>
+      <w:pPr>
+        <w:spacing w:after="140" w:before="0" w:line="360" w:lineRule="auto"/>
+        <w:ind w:firstLine="709"/>
+        <w:jc w:val="both"/>
+      </w:pPr>
+      <w:r>
+        <w:rPr>
+          <w:rFonts w:ascii="Times New Roman" w:cs="Times New Roman" w:eastAsia="Times New Roman" w:hAnsi="Times New Roman"/>
+          <w:sz w:val="28"/>
+          <w:szCs w:val="28"/>
+        </w:rPr>
+        <w:t xml:space="preserve">Ответ: Это сделано намеренно по правилам разделения доступа: внутреннее расписание бригад, больничные листы и отпуска сотрудников являются служебной информацией клиники и доступны только в личном кабинете врача и в панели администратора. Клиент же при записи видит уже готовые доступные часы приёма выбранного специалиста.</w:t>
+      </w:r>
+    </w:p>
+    <w:p>
+      <w:pPr>
+        <w:spacing w:after="40" w:before="0" w:line="360" w:lineRule="auto"/>
+        <w:ind w:firstLine="0"/>
+        <w:jc w:val="both"/>
+      </w:pPr>
+      <w:r>
+        <w:rPr>
+          <w:rFonts w:ascii="Times New Roman" w:cs="Times New Roman" w:eastAsia="Times New Roman" w:hAnsi="Times New Roman"/>
+          <w:b/>
+          <w:bCs/>
+          <w:sz w:val="28"/>
+          <w:szCs w:val="28"/>
+        </w:rPr>
+        <w:t xml:space="preserve">Вопрос 6: Как проверялась работоспособность сайта?</w:t>
       </w:r>
     </w:p>
     <w:p>

</xml_diff>